<commit_message>
User manual update for image comparisons
</commit_message>
<xml_diff>
--- a/PPD User Manual.docx
+++ b/PPD User Manual.docx
@@ -221,6 +221,45 @@
       </w:pPr>
       <w:r>
         <w:t>All white space will be retrained in string.</w:t>
+      </w:r>
+    </w:p>
+    <w:p>
+      <w:pPr>
+        <w:pStyle w:val="ListParagraph"/>
+        <w:numPr>
+          <w:ilvl w:val="0"/>
+          <w:numId w:val="20"/>
+        </w:numPr>
+        <w:spacing w:after="0" w:line="240" w:lineRule="auto"/>
+      </w:pPr>
+      <w:r>
+        <w:t xml:space="preserve">Image comparisons. </w:t>
+      </w:r>
+    </w:p>
+    <w:p>
+      <w:pPr>
+        <w:pStyle w:val="ListParagraph"/>
+        <w:numPr>
+          <w:ilvl w:val="1"/>
+          <w:numId w:val="20"/>
+        </w:numPr>
+        <w:spacing w:after="0" w:line="240" w:lineRule="auto"/>
+      </w:pPr>
+      <w:r>
+        <w:t xml:space="preserve">Counts of the number of images in each presentation file. </w:t>
+      </w:r>
+    </w:p>
+    <w:p>
+      <w:pPr>
+        <w:pStyle w:val="ListParagraph"/>
+        <w:numPr>
+          <w:ilvl w:val="1"/>
+          <w:numId w:val="20"/>
+        </w:numPr>
+        <w:spacing w:after="0" w:line="240" w:lineRule="auto"/>
+      </w:pPr>
+      <w:r>
+        <w:t xml:space="preserve">Image information collection. Example of image information includes image file type information. </w:t>
       </w:r>
     </w:p>
     <w:p>

</xml_diff>

<commit_message>
PPD-6 user manual update for shape names
</commit_message>
<xml_diff>
--- a/PPD User Manual.docx
+++ b/PPD User Manual.docx
@@ -364,6 +364,19 @@
       </w:pPr>
       <w:r>
         <w:t xml:space="preserve">A count of the number of shapes on the slide. </w:t>
+      </w:r>
+    </w:p>
+    <w:p>
+      <w:pPr>
+        <w:pStyle w:val="ListParagraph"/>
+        <w:numPr>
+          <w:ilvl w:val="1"/>
+          <w:numId w:val="20"/>
+        </w:numPr>
+        <w:spacing w:after="0" w:line="240" w:lineRule="auto"/>
+      </w:pPr>
+      <w:r>
+        <w:t xml:space="preserve">Shape name collection. </w:t>
       </w:r>
     </w:p>
     <w:p>

</xml_diff>

<commit_message>
PPD-10 user manual update for slide layout check
</commit_message>
<xml_diff>
--- a/PPD User Manual.docx
+++ b/PPD User Manual.docx
@@ -299,6 +299,19 @@
       </w:pPr>
       <w:r>
         <w:t>Slide Number</w:t>
+      </w:r>
+    </w:p>
+    <w:p>
+      <w:pPr>
+        <w:pStyle w:val="ListParagraph"/>
+        <w:numPr>
+          <w:ilvl w:val="1"/>
+          <w:numId w:val="20"/>
+        </w:numPr>
+        <w:spacing w:after="0" w:line="240" w:lineRule="auto"/>
+      </w:pPr>
+      <w:r>
+        <w:t>Slide Layout</w:t>
       </w:r>
     </w:p>
     <w:p>

</xml_diff>

<commit_message>
PPD-9 user manual updated for master slide counts
</commit_message>
<xml_diff>
--- a/PPD User Manual.docx
+++ b/PPD User Manual.docx
@@ -260,6 +260,19 @@
       </w:pPr>
       <w:r>
         <w:t xml:space="preserve">Image information collection. Example of image information includes image file type information. </w:t>
+      </w:r>
+    </w:p>
+    <w:p>
+      <w:pPr>
+        <w:pStyle w:val="ListParagraph"/>
+        <w:numPr>
+          <w:ilvl w:val="0"/>
+          <w:numId w:val="20"/>
+        </w:numPr>
+        <w:spacing w:after="0" w:line="240" w:lineRule="auto"/>
+      </w:pPr>
+      <w:r>
+        <w:t>The number of master slides.</w:t>
       </w:r>
     </w:p>
     <w:p>

</xml_diff>